<commit_message>
fix : memperbaiki halaman stock gudang
</commit_message>
<xml_diff>
--- a/storage/templates/permohonan-cuti-dan-pengalihan-tugas.docx
+++ b/storage/templates/permohonan-cuti-dan-pengalihan-tugas.docx
@@ -2605,7 +2605,19 @@
         <w:rPr>
           <w:spacing w:val="-10"/>
         </w:rPr>
-        <w:t>${nama_pemberi}</w:t>
+        <w:t>${nama_</w:t>
+      </w:r>
+      <w:r>
+        <w:rPr>
+          <w:spacing w:val="-10"/>
+        </w:rPr>
+        <w:t>karyawan</w:t>
+      </w:r>
+      <w:r>
+        <w:rPr>
+          <w:spacing w:val="-10"/>
+        </w:rPr>
+        <w:t>}</w:t>
       </w:r>
     </w:p>
     <w:p>
@@ -2640,7 +2652,25 @@
         <w:rPr>
           <w:spacing w:val="-10"/>
         </w:rPr>
-        <w:t>${jabatan_pemberi}</w:t>
+        <w:t>${jabatan_</w:t>
+      </w:r>
+      <w:r>
+        <w:rPr>
+          <w:spacing w:val="-10"/>
+        </w:rPr>
+        <w:t>karyawan</w:t>
+      </w:r>
+      <w:r>
+        <w:rPr>
+          <w:spacing w:val="-10"/>
+        </w:rPr>
+        <w:t xml:space="preserve"> </w:t>
+      </w:r>
+      <w:r>
+        <w:rPr>
+          <w:spacing w:val="-10"/>
+        </w:rPr>
+        <w:t>}</w:t>
       </w:r>
     </w:p>
     <w:p>
@@ -2678,7 +2708,31 @@
         <w:rPr>
           <w:spacing w:val="-10"/>
         </w:rPr>
-        <w:t>${sub_divisi_pemberi}</w:t>
+        <w:t>${sub_divisi_</w:t>
+      </w:r>
+      <w:r>
+        <w:rPr>
+          <w:spacing w:val="-10"/>
+        </w:rPr>
+        <w:t xml:space="preserve"> </w:t>
+      </w:r>
+      <w:r>
+        <w:rPr>
+          <w:spacing w:val="-10"/>
+        </w:rPr>
+        <w:t>karyawan</w:t>
+      </w:r>
+      <w:r>
+        <w:rPr>
+          <w:spacing w:val="-10"/>
+        </w:rPr>
+        <w:t xml:space="preserve"> </w:t>
+      </w:r>
+      <w:r>
+        <w:rPr>
+          <w:spacing w:val="-10"/>
+        </w:rPr>
+        <w:t>}</w:t>
       </w:r>
     </w:p>
     <w:p>
@@ -2708,7 +2762,31 @@
         <w:rPr>
           <w:spacing w:val="-10"/>
         </w:rPr>
-        <w:t>${divisi_pemberi}</w:t>
+        <w:t>${divisi_</w:t>
+      </w:r>
+      <w:r>
+        <w:rPr>
+          <w:spacing w:val="-10"/>
+        </w:rPr>
+        <w:t xml:space="preserve"> </w:t>
+      </w:r>
+      <w:r>
+        <w:rPr>
+          <w:spacing w:val="-10"/>
+        </w:rPr>
+        <w:t>karyawan</w:t>
+      </w:r>
+      <w:r>
+        <w:rPr>
+          <w:spacing w:val="-10"/>
+        </w:rPr>
+        <w:t xml:space="preserve"> </w:t>
+      </w:r>
+      <w:r>
+        <w:rPr>
+          <w:spacing w:val="-10"/>
+        </w:rPr>
+        <w:t>}</w:t>
       </w:r>
     </w:p>
     <w:p>
@@ -2770,7 +2848,19 @@
         <w:rPr>
           <w:spacing w:val="-10"/>
         </w:rPr>
-        <w:t>${nama_penerima}</w:t>
+        <w:t>${nama_penerima</w:t>
+      </w:r>
+      <w:r>
+        <w:rPr>
+          <w:spacing w:val="-10"/>
+        </w:rPr>
+        <w:t>_tugas</w:t>
+      </w:r>
+      <w:r>
+        <w:rPr>
+          <w:spacing w:val="-10"/>
+        </w:rPr>
+        <w:t>}</w:t>
       </w:r>
     </w:p>
     <w:p>
@@ -2805,7 +2895,19 @@
         <w:rPr>
           <w:spacing w:val="-10"/>
         </w:rPr>
-        <w:t>${jabatan_penerima}</w:t>
+        <w:t>${jabatan_penerima</w:t>
+      </w:r>
+      <w:r>
+        <w:rPr>
+          <w:spacing w:val="-10"/>
+        </w:rPr>
+        <w:t>_tugas</w:t>
+      </w:r>
+      <w:r>
+        <w:rPr>
+          <w:spacing w:val="-10"/>
+        </w:rPr>
+        <w:t>}</w:t>
       </w:r>
     </w:p>
     <w:p>
@@ -2844,7 +2946,19 @@
         <w:rPr>
           <w:spacing w:val="-10"/>
         </w:rPr>
-        <w:t>${sub_divisi_penerima}</w:t>
+        <w:t>${sub_divisi_penerima</w:t>
+      </w:r>
+      <w:r>
+        <w:rPr>
+          <w:spacing w:val="-10"/>
+        </w:rPr>
+        <w:t>_tugas</w:t>
+      </w:r>
+      <w:r>
+        <w:rPr>
+          <w:spacing w:val="-10"/>
+        </w:rPr>
+        <w:t>}</w:t>
       </w:r>
     </w:p>
     <w:p>
@@ -2874,7 +2988,19 @@
         <w:rPr>
           <w:spacing w:val="-10"/>
         </w:rPr>
-        <w:t>${divisi_penerima}</w:t>
+        <w:t>${divisi_penerima</w:t>
+      </w:r>
+      <w:r>
+        <w:rPr>
+          <w:spacing w:val="-10"/>
+        </w:rPr>
+        <w:t>_tugas</w:t>
+      </w:r>
+      <w:r>
+        <w:rPr>
+          <w:spacing w:val="-10"/>
+        </w:rPr>
+        <w:t>}</w:t>
       </w:r>
     </w:p>
     <w:p>
@@ -3414,7 +3540,19 @@
         <w:rPr>
           <w:spacing w:val="-2"/>
         </w:rPr>
-        <w:t>${nama_pemberi}</w:t>
+        <w:t>${nama_</w:t>
+      </w:r>
+      <w:r>
+        <w:rPr>
+          <w:spacing w:val="-2"/>
+        </w:rPr>
+        <w:t>karyawan</w:t>
+      </w:r>
+      <w:r>
+        <w:rPr>
+          <w:spacing w:val="-2"/>
+        </w:rPr>
+        <w:t>}</w:t>
       </w:r>
       <w:r>
         <w:rPr>
@@ -3435,7 +3573,19 @@
         <w:rPr>
           <w:spacing w:val="-5"/>
         </w:rPr>
-        <w:t>${nama_penerima}</w:t>
+        <w:t>${nama_penerima</w:t>
+      </w:r>
+      <w:r>
+        <w:rPr>
+          <w:spacing w:val="-5"/>
+        </w:rPr>
+        <w:t>_tugas</w:t>
+      </w:r>
+      <w:r>
+        <w:rPr>
+          <w:spacing w:val="-5"/>
+        </w:rPr>
+        <w:t>}</w:t>
       </w:r>
       <w:r>
         <w:rPr>

</xml_diff>

<commit_message>
feat : menambahkan surat cuti surat cuti pada form pengajuan cuti
</commit_message>
<xml_diff>
--- a/storage/templates/permohonan-cuti-dan-pengalihan-tugas.docx
+++ b/storage/templates/permohonan-cuti-dan-pengalihan-tugas.docx
@@ -465,10 +465,9 @@
             </w:pPr>
             <w:r>
               <w:rPr>
-                <w:rFonts w:ascii="Times New Roman"/>
-                <w:sz w:val="24"/>
-              </w:rPr>
-              <w:t>${nama_pemohon}</w:t>
+                <w:spacing w:val="-10"/>
+              </w:rPr>
+              <w:t>${nama_karyawan}</w:t>
             </w:r>
           </w:p>
         </w:tc>
@@ -492,7 +491,21 @@
                 <w:rFonts w:ascii="Times New Roman"/>
                 <w:sz w:val="24"/>
               </w:rPr>
-              <w:t>${nama_pemohon}</w:t>
+              <w:t>${nama_</w:t>
+            </w:r>
+            <w:r>
+              <w:rPr>
+                <w:rFonts w:ascii="Times New Roman"/>
+                <w:sz w:val="24"/>
+              </w:rPr>
+              <w:t>menyetujui</w:t>
+            </w:r>
+            <w:r>
+              <w:rPr>
+                <w:rFonts w:ascii="Times New Roman"/>
+                <w:sz w:val="24"/>
+              </w:rPr>
+              <w:t>}</w:t>
             </w:r>
           </w:p>
         </w:tc>

</xml_diff>